<commit_message>
Embed exp4 screenshots into report
</commit_message>
<xml_diff>
--- a/reports/实验四_赶作业_实验报告.docx
+++ b/reports/实验四_赶作业_实验报告.docx
@@ -1228,22 +1228,7 @@
     </w:p>
     <w:p>
       <w:r>
-        <w:t>按照指导书要求，本节建议补充以下实验内容截图：</w:t>
-      </w:r>
-    </w:p>
-    <w:p>
-      <w:r>
-        <w:t>1. 截图 1：贪心排序和并查集安排逻辑的代码调试截图。</w:t>
-      </w:r>
-    </w:p>
-    <w:p>
-      <w:r>
-        <w:t>2. 截图 2：输入指导书三组样例后的运行结果截图。</w:t>
-      </w:r>
-    </w:p>
-    <w:p>
-      <w:r>
-        <w:t>3. 截图 3：程序输出最少扣分结果的截图。</w:t>
+        <w:t>本实验的核心代码截图与运行结果截图如下：</w:t>
       </w:r>
     </w:p>
     <w:p>
@@ -1251,7 +1236,7 @@
         <w:jc w:val="center"/>
       </w:pPr>
       <w:r>
-        <w:t>【在此插入实验内容截图 1】</w:t>
+        <w:t>图 4-1 程序开头与并查集定义</w:t>
       </w:r>
     </w:p>
     <w:p>
@@ -1259,7 +1244,38 @@
         <w:jc w:val="center"/>
       </w:pPr>
       <w:r>
-        <w:t>【在此插入实验内容截图 2】</w:t>
+        <w:drawing>
+          <wp:inline xmlns:a="http://schemas.openxmlformats.org/drawingml/2006/main" xmlns:pic="http://schemas.openxmlformats.org/drawingml/2006/picture">
+            <wp:extent cx="5669280" cy="3421117"/>
+            <wp:docPr id="8" name="Picture 8"/>
+            <wp:cNvGraphicFramePr>
+              <a:graphicFrameLocks noChangeAspect="1"/>
+            </wp:cNvGraphicFramePr>
+            <a:graphic>
+              <a:graphicData uri="http://schemas.openxmlformats.org/drawingml/2006/picture">
+                <pic:pic>
+                  <pic:nvPicPr>
+                    <pic:cNvPr id="0" name="截屏2026-04-07 09.09.20.png"/>
+                    <pic:cNvPicPr/>
+                  </pic:nvPicPr>
+                  <pic:blipFill>
+                    <a:blip r:embed="rId8"/>
+                    <a:stretch>
+                      <a:fillRect/>
+                    </a:stretch>
+                  </pic:blipFill>
+                  <pic:spPr>
+                    <a:xfrm>
+                      <a:off x="0" y="0"/>
+                      <a:ext cx="5669280" cy="3421117"/>
+                    </a:xfrm>
+                    <a:prstGeom prst="rect"/>
+                  </pic:spPr>
+                </pic:pic>
+              </a:graphicData>
+            </a:graphic>
+          </wp:inline>
+        </w:drawing>
       </w:r>
     </w:p>
     <w:p>
@@ -1267,7 +1283,187 @@
         <w:jc w:val="center"/>
       </w:pPr>
       <w:r>
-        <w:t>【在此插入实验内容截图 3】</w:t>
+        <w:t>图 4-2 输入处理与作业数据构造</w:t>
+      </w:r>
+    </w:p>
+    <w:p>
+      <w:pPr>
+        <w:jc w:val="center"/>
+      </w:pPr>
+      <w:r>
+        <w:drawing>
+          <wp:inline xmlns:a="http://schemas.openxmlformats.org/drawingml/2006/main" xmlns:pic="http://schemas.openxmlformats.org/drawingml/2006/picture">
+            <wp:extent cx="5669280" cy="3421117"/>
+            <wp:docPr id="9" name="Picture 9"/>
+            <wp:cNvGraphicFramePr>
+              <a:graphicFrameLocks noChangeAspect="1"/>
+            </wp:cNvGraphicFramePr>
+            <a:graphic>
+              <a:graphicData uri="http://schemas.openxmlformats.org/drawingml/2006/picture">
+                <pic:pic>
+                  <pic:nvPicPr>
+                    <pic:cNvPr id="0" name="截屏2026-04-07 09.09.27.png"/>
+                    <pic:cNvPicPr/>
+                  </pic:nvPicPr>
+                  <pic:blipFill>
+                    <a:blip r:embed="rId9"/>
+                    <a:stretch>
+                      <a:fillRect/>
+                    </a:stretch>
+                  </pic:blipFill>
+                  <pic:spPr>
+                    <a:xfrm>
+                      <a:off x="0" y="0"/>
+                      <a:ext cx="5669280" cy="3421117"/>
+                    </a:xfrm>
+                    <a:prstGeom prst="rect"/>
+                  </pic:spPr>
+                </pic:pic>
+              </a:graphicData>
+            </a:graphic>
+          </wp:inline>
+        </w:drawing>
+      </w:r>
+    </w:p>
+    <w:p>
+      <w:pPr>
+        <w:jc w:val="center"/>
+      </w:pPr>
+      <w:r>
+        <w:t>图 4-3 贪心排序与最晚可行安排逻辑</w:t>
+      </w:r>
+    </w:p>
+    <w:p>
+      <w:pPr>
+        <w:jc w:val="center"/>
+      </w:pPr>
+      <w:r>
+        <w:drawing>
+          <wp:inline xmlns:a="http://schemas.openxmlformats.org/drawingml/2006/main" xmlns:pic="http://schemas.openxmlformats.org/drawingml/2006/picture">
+            <wp:extent cx="5669280" cy="3421117"/>
+            <wp:docPr id="10" name="Picture 10"/>
+            <wp:cNvGraphicFramePr>
+              <a:graphicFrameLocks noChangeAspect="1"/>
+            </wp:cNvGraphicFramePr>
+            <a:graphic>
+              <a:graphicData uri="http://schemas.openxmlformats.org/drawingml/2006/picture">
+                <pic:pic>
+                  <pic:nvPicPr>
+                    <pic:cNvPr id="0" name="截屏2026-04-07 09.09.30.png"/>
+                    <pic:cNvPicPr/>
+                  </pic:nvPicPr>
+                  <pic:blipFill>
+                    <a:blip r:embed="rId10"/>
+                    <a:stretch>
+                      <a:fillRect/>
+                    </a:stretch>
+                  </pic:blipFill>
+                  <pic:spPr>
+                    <a:xfrm>
+                      <a:off x="0" y="0"/>
+                      <a:ext cx="5669280" cy="3421117"/>
+                    </a:xfrm>
+                    <a:prstGeom prst="rect"/>
+                  </pic:spPr>
+                </pic:pic>
+              </a:graphicData>
+            </a:graphic>
+          </wp:inline>
+        </w:drawing>
+      </w:r>
+    </w:p>
+    <w:p>
+      <w:pPr>
+        <w:jc w:val="center"/>
+      </w:pPr>
+      <w:r>
+        <w:t>图 4-4 实验四测试用例</w:t>
+      </w:r>
+    </w:p>
+    <w:p>
+      <w:pPr>
+        <w:jc w:val="center"/>
+      </w:pPr>
+      <w:r>
+        <w:drawing>
+          <wp:inline xmlns:a="http://schemas.openxmlformats.org/drawingml/2006/main" xmlns:pic="http://schemas.openxmlformats.org/drawingml/2006/picture">
+            <wp:extent cx="5669280" cy="3421117"/>
+            <wp:docPr id="11" name="Picture 11"/>
+            <wp:cNvGraphicFramePr>
+              <a:graphicFrameLocks noChangeAspect="1"/>
+            </wp:cNvGraphicFramePr>
+            <a:graphic>
+              <a:graphicData uri="http://schemas.openxmlformats.org/drawingml/2006/picture">
+                <pic:pic>
+                  <pic:nvPicPr>
+                    <pic:cNvPr id="0" name="截屏2026-04-07 09.09.36.png"/>
+                    <pic:cNvPicPr/>
+                  </pic:nvPicPr>
+                  <pic:blipFill>
+                    <a:blip r:embed="rId11"/>
+                    <a:stretch>
+                      <a:fillRect/>
+                    </a:stretch>
+                  </pic:blipFill>
+                  <pic:spPr>
+                    <a:xfrm>
+                      <a:off x="0" y="0"/>
+                      <a:ext cx="5669280" cy="3421117"/>
+                    </a:xfrm>
+                    <a:prstGeom prst="rect"/>
+                  </pic:spPr>
+                </pic:pic>
+              </a:graphicData>
+            </a:graphic>
+          </wp:inline>
+        </w:drawing>
+      </w:r>
+    </w:p>
+    <w:p>
+      <w:pPr>
+        <w:jc w:val="center"/>
+      </w:pPr>
+      <w:r>
+        <w:t>图 4-5 实验四编译与运行结果</w:t>
+      </w:r>
+    </w:p>
+    <w:p>
+      <w:pPr>
+        <w:jc w:val="center"/>
+      </w:pPr>
+      <w:r>
+        <w:drawing>
+          <wp:inline xmlns:a="http://schemas.openxmlformats.org/drawingml/2006/main" xmlns:pic="http://schemas.openxmlformats.org/drawingml/2006/picture">
+            <wp:extent cx="5669280" cy="3563714"/>
+            <wp:docPr id="12" name="Picture 12"/>
+            <wp:cNvGraphicFramePr>
+              <a:graphicFrameLocks noChangeAspect="1"/>
+            </wp:cNvGraphicFramePr>
+            <a:graphic>
+              <a:graphicData uri="http://schemas.openxmlformats.org/drawingml/2006/picture">
+                <pic:pic>
+                  <pic:nvPicPr>
+                    <pic:cNvPr id="0" name="截屏2026-04-07 09.10.17.png"/>
+                    <pic:cNvPicPr/>
+                  </pic:nvPicPr>
+                  <pic:blipFill>
+                    <a:blip r:embed="rId12"/>
+                    <a:stretch>
+                      <a:fillRect/>
+                    </a:stretch>
+                  </pic:blipFill>
+                  <pic:spPr>
+                    <a:xfrm>
+                      <a:off x="0" y="0"/>
+                      <a:ext cx="5669280" cy="3563714"/>
+                    </a:xfrm>
+                    <a:prstGeom prst="rect"/>
+                  </pic:spPr>
+                </pic:pic>
+              </a:graphicData>
+            </a:graphic>
+          </wp:inline>
+        </w:drawing>
       </w:r>
     </w:p>
     <w:p>

</xml_diff>